<commit_message>
Condense the write-up to 3 pages
Replaces the AI usage table with a paragraph plus the two verification catches
that actually changed the result. The full log is AI_USAGE.md, which is the
deliverable the brief asks for, so the table duplicated it.
</commit_message>
<xml_diff>
--- a/docs/Off_Ball_Run_Value__Write_Up.docx
+++ b/docs/Off_Ball_Run_Value__Write_Up.docx
@@ -5556,7 +5556,7 @@
           <w:color w:val="5B4FD6"/>
           <w:sz w:val="22"/>
         </w:rPr>
-        <w:t>10  AI usage, in short</w:t>
+        <w:t>10  AI usage</w:t>
       </w:r>
     </w:p>
     <w:p>
@@ -5570,7 +5570,7 @@
           <w:i w:val="0"/>
           <w:sz w:val="18"/>
         </w:rPr>
-        <w:t xml:space="preserve">Full log with representative prompts, accepted/modified/rejected detail and the errors I caught is in </w:t>
+        <w:t xml:space="preserve">The full log is </w:t>
       </w:r>
       <w:r>
         <w:rPr>
@@ -5588,438 +5588,92 @@
           <w:i w:val="0"/>
           <w:sz w:val="18"/>
         </w:rPr>
-        <w:t xml:space="preserve"> in the repo. Summary:</w:t>
+        <w:t xml:space="preserve"> in the repo: which tools, where they were used, representative prompts, and for each substantive step what I accepted, what I modified and what I rejected. The short version: the framing and the metric concept are mine — model off-ball runs as a supervised, xG-style problem rather than a grid. The assistant recommended LightGBM with </w:t>
+      </w:r>
+      <w:r>
+        <w:rPr>
+          <w:rFonts w:ascii="Menlo" w:hAnsi="Menlo"/>
+          <w:b w:val="0"/>
+          <w:i w:val="0"/>
+          <w:sz w:val="16"/>
+        </w:rPr>
+        <w:t>GroupKFold</w:t>
+      </w:r>
+      <w:r>
+        <w:rPr>
+          <w:rFonts w:ascii="Helvetica Neue" w:hAnsi="Helvetica Neue"/>
+          <w:b w:val="0"/>
+          <w:i w:val="0"/>
+          <w:sz w:val="18"/>
+        </w:rPr>
+        <w:t xml:space="preserve"> and drafted the defensive geometry; I rejected the density counters and required the ablation before believing any of it. The two interventions that changed the result were both verification, not generation:</w:t>
       </w:r>
     </w:p>
-    <w:tbl>
-      <w:tblPr>
-        <w:tblStyle w:val="TableGrid"/>
-        <w:tblW w:type="auto" w:w="0"/>
-        <w:tblLook w:firstColumn="1" w:firstRow="1" w:lastColumn="0" w:lastRow="0" w:noHBand="0" w:noVBand="1" w:val="04A0"/>
-      </w:tblPr>
-      <w:tblGrid>
-        <w:gridCol w:w="3402"/>
-        <w:gridCol w:w="3402"/>
-        <w:gridCol w:w="3402"/>
-      </w:tblGrid>
-      <w:tr>
-        <w:tc>
-          <w:tcPr>
-            <w:tcW w:type="dxa" w:w="3402"/>
-            <w:shd w:val="clear" w:fill="EFEFF6"/>
-          </w:tcPr>
-          <w:p>
-            <w:pPr>
-              <w:spacing w:after="0"/>
-            </w:pPr>
-            <w:r>
-              <w:rPr>
-                <w:rFonts w:ascii="Helvetica Neue" w:hAnsi="Helvetica Neue"/>
-                <w:b/>
-                <w:sz w:val="14"/>
-              </w:rPr>
-              <w:t>Area</w:t>
-            </w:r>
-          </w:p>
-        </w:tc>
-        <w:tc>
-          <w:tcPr>
-            <w:tcW w:type="dxa" w:w="3402"/>
-            <w:shd w:val="clear" w:fill="EFEFF6"/>
-          </w:tcPr>
-          <w:p>
-            <w:pPr>
-              <w:spacing w:after="0"/>
-            </w:pPr>
-            <w:r>
-              <w:rPr>
-                <w:rFonts w:ascii="Helvetica Neue" w:hAnsi="Helvetica Neue"/>
-                <w:b/>
-                <w:sz w:val="14"/>
-              </w:rPr>
-              <w:t>What the assistant did</w:t>
-            </w:r>
-          </w:p>
-        </w:tc>
-        <w:tc>
-          <w:tcPr>
-            <w:tcW w:type="dxa" w:w="3402"/>
-            <w:shd w:val="clear" w:fill="EFEFF6"/>
-          </w:tcPr>
-          <w:p>
-            <w:pPr>
-              <w:spacing w:after="0"/>
-            </w:pPr>
-            <w:r>
-              <w:rPr>
-                <w:rFonts w:ascii="Helvetica Neue" w:hAnsi="Helvetica Neue"/>
-                <w:b/>
-                <w:sz w:val="14"/>
-              </w:rPr>
-              <w:t>What I did</w:t>
-            </w:r>
-          </w:p>
-        </w:tc>
-      </w:tr>
-      <w:tr>
-        <w:tc>
-          <w:tcPr>
-            <w:tcW w:type="dxa" w:w="3402"/>
-          </w:tcPr>
-          <w:p>
-            <w:pPr>
-              <w:spacing w:after="0"/>
-            </w:pPr>
-            <w:r>
-              <w:rPr>
-                <w:rFonts w:ascii="Helvetica Neue" w:hAnsi="Helvetica Neue"/>
-                <w:b w:val="0"/>
-                <w:i w:val="0"/>
-                <w:sz w:val="15"/>
-              </w:rPr>
-              <w:t>Framing &amp; metric</w:t>
-            </w:r>
-          </w:p>
-        </w:tc>
-        <w:tc>
-          <w:tcPr>
-            <w:tcW w:type="dxa" w:w="3402"/>
-          </w:tcPr>
-          <w:p>
-            <w:pPr>
-              <w:spacing w:after="0"/>
-            </w:pPr>
-            <w:r>
-              <w:rPr>
-                <w:rFonts w:ascii="Helvetica Neue" w:hAnsi="Helvetica Neue"/>
-                <w:b w:val="0"/>
-                <w:i w:val="0"/>
-                <w:sz w:val="15"/>
-              </w:rPr>
-              <w:t>Sketched options once I set the direction</w:t>
-            </w:r>
-          </w:p>
-        </w:tc>
-        <w:tc>
-          <w:tcPr>
-            <w:tcW w:type="dxa" w:w="3402"/>
-          </w:tcPr>
-          <w:p>
-            <w:pPr>
-              <w:spacing w:after="0"/>
-            </w:pPr>
-            <w:r>
-              <w:rPr>
-                <w:rFonts w:ascii="Helvetica Neue" w:hAnsi="Helvetica Neue"/>
-                <w:b w:val="0"/>
-                <w:i w:val="0"/>
-                <w:sz w:val="15"/>
-              </w:rPr>
-              <w:t>Mine: model off-ball runs as a supervised, xG-style problem rather than a grid</w:t>
-            </w:r>
-          </w:p>
-        </w:tc>
-      </w:tr>
-      <w:tr>
-        <w:tc>
-          <w:tcPr>
-            <w:tcW w:type="dxa" w:w="3402"/>
-          </w:tcPr>
-          <w:p>
-            <w:pPr>
-              <w:spacing w:after="0"/>
-            </w:pPr>
-            <w:r>
-              <w:rPr>
-                <w:rFonts w:ascii="Helvetica Neue" w:hAnsi="Helvetica Neue"/>
-                <w:b w:val="0"/>
-                <w:i w:val="0"/>
-                <w:sz w:val="15"/>
-              </w:rPr>
-              <w:t>Model family</w:t>
-            </w:r>
-          </w:p>
-        </w:tc>
-        <w:tc>
-          <w:tcPr>
-            <w:tcW w:type="dxa" w:w="3402"/>
-          </w:tcPr>
-          <w:p>
-            <w:pPr>
-              <w:spacing w:after="0"/>
-            </w:pPr>
-            <w:r>
-              <w:rPr>
-                <w:rFonts w:ascii="Helvetica Neue" w:hAnsi="Helvetica Neue"/>
-                <w:b w:val="0"/>
-                <w:i w:val="0"/>
-                <w:sz w:val="15"/>
-              </w:rPr>
-              <w:t>Recommended LightGBM + GroupKFold</w:t>
-            </w:r>
-          </w:p>
-        </w:tc>
-        <w:tc>
-          <w:tcPr>
-            <w:tcW w:type="dxa" w:w="3402"/>
-          </w:tcPr>
-          <w:p>
-            <w:pPr>
-              <w:spacing w:after="0"/>
-            </w:pPr>
-            <w:r>
-              <w:rPr>
-                <w:rFonts w:ascii="Helvetica Neue" w:hAnsi="Helvetica Neue"/>
-                <w:b w:val="0"/>
-                <w:i w:val="0"/>
-                <w:sz w:val="15"/>
-              </w:rPr>
-              <w:t>Accepted after checking the leakage argument held for nested events</w:t>
-            </w:r>
-          </w:p>
-        </w:tc>
-      </w:tr>
-      <w:tr>
-        <w:tc>
-          <w:tcPr>
-            <w:tcW w:type="dxa" w:w="3402"/>
-          </w:tcPr>
-          <w:p>
-            <w:pPr>
-              <w:spacing w:after="0"/>
-            </w:pPr>
-            <w:r>
-              <w:rPr>
-                <w:rFonts w:ascii="Helvetica Neue" w:hAnsi="Helvetica Neue"/>
-                <w:b w:val="0"/>
-                <w:i w:val="0"/>
-                <w:sz w:val="15"/>
-              </w:rPr>
-              <w:t>Features</w:t>
-            </w:r>
-          </w:p>
-        </w:tc>
-        <w:tc>
-          <w:tcPr>
-            <w:tcW w:type="dxa" w:w="3402"/>
-          </w:tcPr>
-          <w:p>
-            <w:pPr>
-              <w:spacing w:after="0"/>
-            </w:pPr>
-            <w:r>
-              <w:rPr>
-                <w:rFonts w:ascii="Helvetica Neue" w:hAnsi="Helvetica Neue"/>
-                <w:b w:val="0"/>
-                <w:i w:val="0"/>
-                <w:sz w:val="15"/>
-              </w:rPr>
-              <w:t>Drafted the geometry (encirclement, block spread)</w:t>
-            </w:r>
-          </w:p>
-        </w:tc>
-        <w:tc>
-          <w:tcPr>
-            <w:tcW w:type="dxa" w:w="3402"/>
-          </w:tcPr>
-          <w:p>
-            <w:pPr>
-              <w:spacing w:after="0"/>
-            </w:pPr>
-            <w:r>
-              <w:rPr>
-                <w:rFonts w:ascii="Helvetica Neue" w:hAnsi="Helvetica Neue"/>
-                <w:b w:val="0"/>
-                <w:i w:val="0"/>
-                <w:sz w:val="15"/>
-              </w:rPr>
-              <w:t>Rejected the density counters; required the ablation before believing any of it</w:t>
-            </w:r>
-          </w:p>
-        </w:tc>
-      </w:tr>
-      <w:tr>
-        <w:tc>
-          <w:tcPr>
-            <w:tcW w:type="dxa" w:w="3402"/>
-          </w:tcPr>
-          <w:p>
-            <w:pPr>
-              <w:spacing w:after="0"/>
-            </w:pPr>
-            <w:r>
-              <w:rPr>
-                <w:rFonts w:ascii="Helvetica Neue" w:hAnsi="Helvetica Neue"/>
-                <w:b w:val="0"/>
-                <w:i w:val="0"/>
-                <w:sz w:val="15"/>
-              </w:rPr>
-              <w:t>Verification</w:t>
-            </w:r>
-          </w:p>
-        </w:tc>
-        <w:tc>
-          <w:tcPr>
-            <w:tcW w:type="dxa" w:w="3402"/>
-          </w:tcPr>
-          <w:p>
-            <w:pPr>
-              <w:spacing w:after="0"/>
-            </w:pPr>
-            <w:r>
-              <w:rPr>
-                <w:rFonts w:ascii="Helvetica Neue" w:hAnsi="Helvetica Neue"/>
-                <w:b w:val="0"/>
-                <w:i w:val="0"/>
-                <w:sz w:val="15"/>
-              </w:rPr>
-              <w:t>Produced the first, flattering comparison</w:t>
-            </w:r>
-          </w:p>
-        </w:tc>
-        <w:tc>
-          <w:tcPr>
-            <w:tcW w:type="dxa" w:w="3402"/>
-          </w:tcPr>
-          <w:p>
-            <w:pPr>
-              <w:spacing w:after="0"/>
-            </w:pPr>
-            <w:r>
-              <w:rPr>
-                <w:rFonts w:ascii="Helvetica Neue" w:hAnsi="Helvetica Neue"/>
-                <w:b w:val="0"/>
-                <w:i w:val="0"/>
-                <w:sz w:val="15"/>
-              </w:rPr>
-              <w:t>Caught the mislabelled 360 baseline (the "no-360" model contained a 360 feature) — true gain +0.0212, not +0.0069</w:t>
-            </w:r>
-          </w:p>
-        </w:tc>
-      </w:tr>
-      <w:tr>
-        <w:tc>
-          <w:tcPr>
-            <w:tcW w:type="dxa" w:w="3402"/>
-          </w:tcPr>
-          <w:p>
-            <w:pPr>
-              <w:spacing w:after="0"/>
-            </w:pPr>
-            <w:r>
-              <w:rPr>
-                <w:rFonts w:ascii="Helvetica Neue" w:hAnsi="Helvetica Neue"/>
-                <w:b w:val="0"/>
-                <w:i w:val="0"/>
-                <w:sz w:val="15"/>
-              </w:rPr>
-              <w:t>Football sense</w:t>
-            </w:r>
-          </w:p>
-        </w:tc>
-        <w:tc>
-          <w:tcPr>
-            <w:tcW w:type="dxa" w:w="3402"/>
-          </w:tcPr>
-          <w:p>
-            <w:pPr>
-              <w:spacing w:after="0"/>
-            </w:pPr>
-            <w:r>
-              <w:rPr>
-                <w:rFonts w:ascii="Helvetica Neue" w:hAnsi="Helvetica Neue"/>
-                <w:b w:val="0"/>
-                <w:i w:val="0"/>
-                <w:sz w:val="15"/>
-              </w:rPr>
-              <w:t>Proposed reading block spread as "stretched = valuable"</w:t>
-            </w:r>
-          </w:p>
-        </w:tc>
-        <w:tc>
-          <w:tcPr>
-            <w:tcW w:type="dxa" w:w="3402"/>
-          </w:tcPr>
-          <w:p>
-            <w:pPr>
-              <w:spacing w:after="0"/>
-            </w:pPr>
-            <w:r>
-              <w:rPr>
-                <w:rFonts w:ascii="Helvetica Neue" w:hAnsi="Helvetica Neue"/>
-                <w:b w:val="0"/>
-                <w:i w:val="0"/>
-                <w:sz w:val="15"/>
-              </w:rPr>
-              <w:t>Caught the sign: the data says the opposite by 7.6×; it is a depth proxy</w:t>
-            </w:r>
-          </w:p>
-        </w:tc>
-      </w:tr>
-      <w:tr>
-        <w:tc>
-          <w:tcPr>
-            <w:tcW w:type="dxa" w:w="3402"/>
-          </w:tcPr>
-          <w:p>
-            <w:pPr>
-              <w:spacing w:after="0"/>
-            </w:pPr>
-            <w:r>
-              <w:rPr>
-                <w:rFonts w:ascii="Helvetica Neue" w:hAnsi="Helvetica Neue"/>
-                <w:b w:val="0"/>
-                <w:i w:val="0"/>
-                <w:sz w:val="15"/>
-              </w:rPr>
-              <w:t>Plotting &amp; prose</w:t>
-            </w:r>
-          </w:p>
-        </w:tc>
-        <w:tc>
-          <w:tcPr>
-            <w:tcW w:type="dxa" w:w="3402"/>
-          </w:tcPr>
-          <w:p>
-            <w:pPr>
-              <w:spacing w:after="0"/>
-            </w:pPr>
-            <w:r>
-              <w:rPr>
-                <w:rFonts w:ascii="Helvetica Neue" w:hAnsi="Helvetica Neue"/>
-                <w:b w:val="0"/>
-                <w:i w:val="0"/>
-                <w:sz w:val="15"/>
-              </w:rPr>
-              <w:t>First drafts</w:t>
-            </w:r>
-          </w:p>
-        </w:tc>
-        <w:tc>
-          <w:tcPr>
-            <w:tcW w:type="dxa" w:w="3402"/>
-          </w:tcPr>
-          <w:p>
-            <w:pPr>
-              <w:spacing w:after="0"/>
-            </w:pPr>
-            <w:r>
-              <w:rPr>
-                <w:rFonts w:ascii="Helvetica Neue" w:hAnsi="Helvetica Neue"/>
-                <w:b w:val="0"/>
-                <w:i w:val="0"/>
-                <w:sz w:val="15"/>
-              </w:rPr>
-              <w:t>Restyled to my own conventions; fixed runs drawn off-pitch (360 frames are not clamped)</w:t>
-            </w:r>
-          </w:p>
-        </w:tc>
-      </w:tr>
-    </w:tbl>
     <w:p>
       <w:pPr>
-        <w:spacing w:after="40"/>
+        <w:pStyle w:val="ListBullet"/>
+        <w:spacing w:after="80"/>
       </w:pPr>
+      <w:r>
+        <w:rPr>
+          <w:rFonts w:ascii="Helvetica Neue" w:hAnsi="Helvetica Neue"/>
+          <w:b/>
+          <w:i w:val="0"/>
+          <w:sz w:val="18"/>
+        </w:rPr>
+        <w:t>A mislabelled baseline.</w:t>
+      </w:r>
+      <w:r>
+        <w:rPr>
+          <w:rFonts w:ascii="Helvetica Neue" w:hAnsi="Helvetica Neue"/>
+          <w:b w:val="0"/>
+          <w:i w:val="0"/>
+          <w:sz w:val="18"/>
+        </w:rPr>
+        <w:t xml:space="preserve"> The first "without 360" comparison contained a 360 feature — the runner's own position — which flattered the result by +0.0069 AUC. Replacing it with the four-tier ablation gave the real figure, </w:t>
+      </w:r>
+      <w:r>
+        <w:rPr>
+          <w:rFonts w:ascii="Helvetica Neue" w:hAnsi="Helvetica Neue"/>
+          <w:b/>
+          <w:i w:val="0"/>
+          <w:sz w:val="18"/>
+        </w:rPr>
+        <w:t>+0.0212</w:t>
+      </w:r>
+      <w:r>
+        <w:rPr>
+          <w:rFonts w:ascii="Helvetica Neue" w:hAnsi="Helvetica Neue"/>
+          <w:b w:val="0"/>
+          <w:i w:val="0"/>
+          <w:sz w:val="18"/>
+        </w:rPr>
+        <w:t>.</w:t>
+      </w:r>
+    </w:p>
+    <w:p>
+      <w:pPr>
+        <w:pStyle w:val="ListBullet"/>
+        <w:spacing w:after="80"/>
+      </w:pPr>
+      <w:r>
+        <w:rPr>
+          <w:rFonts w:ascii="Helvetica Neue" w:hAnsi="Helvetica Neue"/>
+          <w:b/>
+          <w:i w:val="0"/>
+          <w:sz w:val="18"/>
+        </w:rPr>
+        <w:t>A feature read backwards.</w:t>
+      </w:r>
+      <w:r>
+        <w:rPr>
+          <w:rFonts w:ascii="Helvetica Neue" w:hAnsi="Helvetica Neue"/>
+          <w:b w:val="0"/>
+          <w:i w:val="0"/>
+          <w:sz w:val="18"/>
+        </w:rPr>
+        <w:t xml:space="preserve"> Block spread was about to be reported as "a stretched defence is more valuable". Checked against the data, it says the opposite by 7.6× — it is a depth proxy, not a width one. It stayed in the model and out of the story.</w:t>
+      </w:r>
     </w:p>
     <w:tbl>
       <w:tblPr>

</xml_diff>